<commit_message>
informe fase 1: tarjetas de Aerómetro sin enlazar en el costo de la unidad y textos al largo pedido
</commit_message>
<xml_diff>
--- a/Datos y conclusiones Proyecto 2 Fase 1.docx
+++ b/Datos y conclusiones Proyecto 2 Fase 1.docx
@@ -2332,13 +2332,7 @@
         <w:rPr>
           <w:rFonts w:ascii="Arial" w:hAnsi="Arial" w:cs="Arial"/>
         </w:rPr>
-        <w:t>Cada fila es una persona (usuario_sk). En el Proyecto 1 ya resolvimos la identidad: las tarjetas de Transmetro, Transurbano y MetroRiel se enlazan por su número (TC-00012345, 0000012345 y MR0012345 son la misma persona) y Aerómetro queda aparte porque su llave es un hash que no trae el número. Usar la persona evita contar como abandono a alguien que solo cambió de operador, que es lo que más le importa a la Agencia: que la persona siga en la red, no una tarjeta en particular. El costo es Aerómetro: sus usua</w:t>
-      </w:r>
-      <w:r>
-        <w:rPr>
-          <w:rFonts w:ascii="Arial" w:hAnsi="Arial" w:cs="Arial"/>
-        </w:rPr>
-        <w:t>rios son personas aparte, y si se pasan a otro sistema parecen un abandono. Lo medimos abajo.</w:t>
+        <w:t>Cada fila es una persona (usuario_sk), con la identidad que resolvimos en el Proyecto 1: las tarjetas de Transmetro, Transurbano y MetroRiel se enlazan por su número (TC-00012345, 0000012345 y MR0012345 son la misma persona). Así no contamos como abandono a quien solo cambió de operador, y a la Agencia le importa que la persona siga en la red, no una tarjeta. Aerómetro queda aparte porque su llave es un hash sin el número; ese es el costo y lo medimos abajo.</w:t>
       </w:r>
     </w:p>
     <w:p>
@@ -2828,6 +2822,59 @@
                 <w:rFonts w:ascii="Arial" w:hAnsi="Arial" w:cs="Arial"/>
                 <w:sz w:val="19"/>
               </w:rPr>
+              <w:t>Tarjetas de Aerómetro que no pudimos enlazar (en toda la red)</w:t>
+            </w:r>
+          </w:p>
+        </w:tc>
+        <w:tc>
+          <w:tcPr>
+            <w:tcW w:w="2268" w:type="dxa"/>
+          </w:tcPr>
+          <w:p>
+            <w:pPr>
+              <w:jc w:val="right"/>
+            </w:pPr>
+            <w:r>
+              <w:rPr>
+                <w:rFonts w:ascii="Arial" w:hAnsi="Arial" w:cs="Arial"/>
+                <w:sz w:val="19"/>
+              </w:rPr>
+              <w:t>16,930</w:t>
+            </w:r>
+          </w:p>
+        </w:tc>
+        <w:tc>
+          <w:tcPr>
+            <w:tcW w:w="2268" w:type="dxa"/>
+          </w:tcPr>
+          <w:p>
+            <w:pPr>
+              <w:jc w:val="right"/>
+            </w:pPr>
+            <w:r>
+              <w:rPr>
+                <w:rFonts w:ascii="Arial" w:hAnsi="Arial" w:cs="Arial"/>
+                <w:sz w:val="19"/>
+              </w:rPr>
+              <w:t>16,930</w:t>
+            </w:r>
+          </w:p>
+        </w:tc>
+      </w:tr>
+      <w:tr>
+        <w:trPr>
+          <w:jc w:val="center"/>
+        </w:trPr>
+        <w:tc>
+          <w:tcPr>
+            <w:tcW w:w="4819" w:type="dxa"/>
+          </w:tcPr>
+          <w:p>
+            <w:r>
+              <w:rPr>
+                <w:rFonts w:ascii="Arial" w:hAnsi="Arial" w:cs="Arial"/>
+                <w:sz w:val="19"/>
+              </w:rPr>
               <w:t>Positivos que son personas solo de Aerómetro (no enlazadas)</w:t>
             </w:r>
           </w:p>
@@ -3078,13 +3125,7 @@
         <w:rPr>
           <w:rFonts w:ascii="Arial" w:hAnsi="Arial" w:cs="Arial"/>
         </w:rPr>
-        <w:t>Cómo lo contamos: tomamos los positivos que son personas solo de Aerómetro y buscamos si su hash corresponde a alguna persona de los otros sistemas con la regla md5('am' + número) que revela el script generador. Esa regla no la usamos para construir la unidad (una Agencia real no la tendría), solo para medir el costo, igual que el análisis de sensibilidad del Proyecto 1. Para comparar, también contamos qué pasaría si la unidad fuera la tarjeta: muchas más tarjetas aparecen como abandono aunque la persona si</w:t>
-      </w:r>
-      <w:r>
-        <w:rPr>
-          <w:rFonts w:ascii="Arial" w:hAnsi="Arial" w:cs="Arial"/>
-        </w:rPr>
-        <w:t>guió viajando con otra. Por eso nos quedamos con la persona: su costo es mucho menor.</w:t>
+        <w:t>Cómo lo contamos: las 16,930 tarjetas de Aerómetro son las que no pudimos enlazar y quedan como personas aparte. Buscamos si el hash de los positivos de Aerómetro corresponde a una persona de los otros sistemas con la regla md5('am' + número) del script generador; esa regla solo sirve para medir el costo (una Agencia real no la tendría), igual que en el análisis de sensibilidad del Proyecto 1. Con la tarjeta como unidad, el costo sería mucho mayor (0.210 contra 0.058), por eso nos quedamos con la persona.</w:t>
       </w:r>
     </w:p>
     <w:p>
@@ -5735,13 +5776,7 @@
         <w:rPr>
           <w:rFonts w:ascii="Arial" w:hAnsi="Arial" w:cs="Arial"/>
         </w:rPr>
-        <w:t>Usamos la precisión promedio (average precision, el área bajo la curva precisión-recall). La campaña no alcanza para todos: la Agencia va a contactar a los usuarios con más riesgo, así que importa qué tan bien quedan arriba los que de verdad se van. Además los positivos son pocos (12%), y en ese caso la precisión promedio es más exigente que el ROC-AUC, que se ve bien aunque el modelo se equivoque mucho entre los primeros. No depende de un umbral, que elegimos hasta la Fase 2 con los costos. Reportamos el R</w:t>
-      </w:r>
-      <w:r>
-        <w:rPr>
-          <w:rFonts w:ascii="Arial" w:hAnsi="Arial" w:cs="Arial"/>
-        </w:rPr>
-        <w:t>OC-AUC solo como complemento.</w:t>
+        <w:t>Usamos la precisión promedio (el área bajo la curva precisión-recall). La campaña no alcanza para todos y se contacta a los de más riesgo, así que importa que los que de verdad se van queden arriba. Los positivos son pocos (12%) y ahí es más exigente que el ROC-AUC, que reportamos solo como complemento. Además no depende de un umbral, que elegimos en la Fase 2 con los costos.</w:t>
       </w:r>
     </w:p>
     <w:p>
@@ -6199,7 +6234,7 @@
           <w:noProof/>
         </w:rPr>
         <w:drawing>
-          <wp:inline distT="0" distB="0" distL="0" distR="0" wp14:anchorId="3A5D0299" wp14:editId="1D397A9B">
+          <wp:inline distT="0" distB="0" distL="0" distR="0" wp14:anchorId="0D6CBEED" wp14:editId="1FE5400C">
             <wp:extent cx="5580000" cy="3487500"/>
             <wp:effectExtent l="0" t="0" r="0" b="0"/>
             <wp:docPr id="1" name="Picture 1"/>
@@ -6370,7 +6405,7 @@
                 <w:rFonts w:ascii="Arial" w:hAnsi="Arial" w:cs="Arial"/>
                 <w:sz w:val="19"/>
               </w:rPr>
-              <w:t>Es el que más empuja: cuantos más días lleva sin viajar antes del corte, más probable es que no vuelva. Tiene sentido: el abandono casi siempre empieza con un silencio.</w:t>
+              <w:t>Más días sin viajar antes del corte, más riesgo: el abandono empieza con un silencio.</w:t>
             </w:r>
           </w:p>
         </w:tc>
@@ -6420,7 +6455,7 @@
                 <w:rFonts w:ascii="Arial" w:hAnsi="Arial" w:cs="Arial"/>
                 <w:sz w:val="19"/>
               </w:rPr>
-              <w:t>Los pagos rechazados en Transurbano (saldo insuficiente o tarjeta inválida) suben el riesgo: son fricción en el cobro, y quien no puede pagar deja de viajar.</w:t>
+              <w:t>Los pagos rechazados en Transurbano son fricción en el cobro: quien no puede pagar deja de viajar.</w:t>
             </w:r>
           </w:p>
         </w:tc>
@@ -6470,7 +6505,7 @@
                 <w:rFonts w:ascii="Arial" w:hAnsi="Arial" w:cs="Arial"/>
                 <w:sz w:val="19"/>
               </w:rPr>
-              <w:t>Comparado con los demás perfiles, el perfil general del padrón se va más (17.5% contra 11-12%). No tiene un descuento que lo ate a la red, como el estudiante o el adulto mayor.</w:t>
+              <w:t>El perfil general se va más (17.5% contra 11-12%): no tiene un descuento que lo ate a la red.</w:t>
             </w:r>
           </w:p>
         </w:tc>
@@ -6520,7 +6555,7 @@
                 <w:rFonts w:ascii="Arial" w:hAnsi="Arial" w:cs="Arial"/>
                 <w:sz w:val="19"/>
               </w:rPr>
-              <w:t>Quien viaja más en Aerómetro aparece con más riesgo. En parte es real y en parte es el costo de la unidad: Aerómetro no se enlaza con los otros sistemas, y si esa persona se pasa a otro modo parece que se fue.</w:t>
+              <w:t>Más viajes en Aerómetro, más riesgo; en parte es el costo de la unidad, porque Aerómetro no se enlaza.</w:t>
             </w:r>
           </w:p>
         </w:tc>
@@ -6570,15 +6605,7 @@
                 <w:rFonts w:ascii="Arial" w:hAnsi="Arial" w:cs="Arial"/>
                 <w:sz w:val="19"/>
               </w:rPr>
-              <w:t xml:space="preserve">Sale positivo, pero no significa que viajar más aumente el riesgo. Está muy correlacionado con viajes_7d, viajes_28d y dias_activos_28d, que ya restan mucho: a igual cantidad de viajes en la última semana y de días activos, tener más viajes </w:t>
-            </w:r>
-            <w:r>
-              <w:rPr>
-                <w:rFonts w:ascii="Arial" w:hAnsi="Arial" w:cs="Arial"/>
-                <w:sz w:val="19"/>
-              </w:rPr>
-              <w:lastRenderedPageBreak/>
-              <w:t>concentrados en las dos semanas da un pequeño ajuste. Por sí sola, más viajes = menos riesgo.</w:t>
+              <w:t>Positivo solo por la correlación con viajes_7d y dias_activos_28d, que ya restan mucho; sola, más viajes es menos riesgo.</w:t>
             </w:r>
           </w:p>
         </w:tc>
@@ -6606,6 +6633,7 @@
           <w:rFonts w:ascii="Arial" w:hAnsi="Arial" w:cs="Arial"/>
           <w:color w:val="auto"/>
         </w:rPr>
+        <w:lastRenderedPageBreak/>
         <w:t>Rendimiento medido</w:t>
       </w:r>
     </w:p>

</xml_diff>